<commit_message>
Milestone 2 report: add the stakeholder's October 28 review, decisions and agreed scope
Section 1 now records his written review of the working system, his design
decisions (small model default, automatic date handling, refund rule key) and
the agreed deliverables and targets. Section 6 follows his scope cuts and dates.
</commit_message>
<xml_diff>
--- a/docs/milestone2/Group25_DataSage_Milestone2.docx
+++ b/docs/milestone2/Group25_DataSage_Milestone2.docx
@@ -60,7 +60,7 @@
         <w:t>Meeting date:</w:t>
       </w:r>
       <w:r>
-        <w:t xml:space="preserve"> October 19, 2026</w:t>
+        <w:t xml:space="preserve"> October 19, 2026 (written review October 28, 2026)</w:t>
       </w:r>
     </w:p>
     <w:tbl>
@@ -443,25 +443,7 @@
         <w:t>Meeting.</w:t>
       </w:r>
       <w:r>
-        <w:t xml:space="preserve"> October 19, 2026, </w:t>
-      </w:r>
-      <w:r>
-        <w:rPr>
-          <w:highlight w:val="yellow"/>
-        </w:rPr>
-        <w:t>[time]</w:t>
-      </w:r>
-      <w:r>
-        <w:t xml:space="preserve">, </w:t>
-      </w:r>
-      <w:r>
-        <w:rPr>
-          <w:highlight w:val="yellow"/>
-        </w:rPr>
-        <w:t>[Zoom or in person]</w:t>
-      </w:r>
-      <w:r>
-        <w:t xml:space="preserve">. Participants: Vyshanth Buddani (stakeholder) and all five team members: Shrey Bishnoi, Arsha Jindal, Ritik Agarwal, Vatsal Nirmal and Maulik Jadav. </w:t>
+        <w:t xml:space="preserve"> October 19, 2026, 2:00 to 2:45 PM MST, on Zoom. Participants: Vyshanth Buddani (stakeholder) and all five team members: Shrey Bishnoi, Arsha Jindal, Ritik Agarwal, Vatsal Nirmal and Maulik Jadav. </w:t>
       </w:r>
       <w:r>
         <w:rPr>
@@ -476,7 +458,7 @@
         <w:rPr>
           <w:highlight w:val="yellow"/>
         </w:rPr>
-        <w:t>[agenda, what the stakeholder said, decisions and action items]</w:t>
+        <w:t>[what was discussed on October 19, and his feedback then]</w:t>
       </w:r>
       <w:r>
         <w:t>.</w:t>
@@ -488,40 +470,34 @@
         <w:rPr>
           <w:b/>
         </w:rPr>
-        <w:t>What we presented.</w:t>
-      </w:r>
-      <w:r>
-        <w:t xml:space="preserve"> </w:t>
+        <w:t>Review of the working system (October 28, 2026).</w:t>
+      </w:r>
+      <w:r>
+        <w:t xml:space="preserve"> Once the system was built we sent Vyshanth the demo on his file (Section 4), the results (Section 3) and a decision form; he answered in writing and signed off that he reviewed both. </w:t>
       </w:r>
       <w:r>
         <w:rPr>
-          <w:highlight w:val="yellow"/>
+          <w:b/>
         </w:rPr>
-        <w:t>[What the team showed or discussed on October 19.]</w:t>
+        <w:t>Useful:</w:t>
+      </w:r>
+      <w:r>
+        <w:t xml:space="preserve"> the replay script, the change log and the approvals, which he said give full auditability and would make him trust an answer; 3 questions on his file is ideal and the report layout can stay. </w:t>
+      </w:r>
+      <w:r>
+        <w:rPr>
+          <w:b/>
+        </w:rPr>
+        <w:t>Still unmet:</w:t>
+      </w:r>
+      <w:r>
+        <w:t xml:space="preserve"> inconsistent date strings and negative refund rows. The small model's speed (about 15 s) convinced him it should be the default.</w:t>
       </w:r>
     </w:p>
     <w:p>
       <w:pPr/>
       <w:r>
-        <w:rPr>
-          <w:b/>
-        </w:rPr>
-        <w:t>What was useful and what is still missing.</w:t>
-      </w:r>
-      <w:r>
-        <w:t xml:space="preserve"> </w:t>
-      </w:r>
-      <w:r>
-        <w:rPr>
-          <w:highlight w:val="yellow"/>
-        </w:rPr>
-        <w:t>[Which results the stakeholder found useful, which needs remain unmet, and any changes he asked for.]</w:t>
-      </w:r>
-    </w:p>
-    <w:p>
-      <w:pPr/>
-      <w:r>
-        <w:t>Table 1 lists the stakeholder's feedback, what we did about it, and what comes next. Rows 1 to 5 come from the Milestone 1 meeting on September 28, 2026. Rows 6 and 7 come from the October 19 meeting.</w:t>
+        <w:t>Table 1 lists his feedback, what we did about it and what comes next. Rows 1 to 5 come from the Milestone 1 meeting on September 28, 2026; rows 6 to 9 come from his October 28 review.</w:t>
       </w:r>
     </w:p>
     <w:p>
@@ -548,9 +524,9 @@
       </w:tblPr>
       <w:tblGrid>
         <w:gridCol w:w="360"/>
+        <w:gridCol w:w="2808"/>
+        <w:gridCol w:w="3528"/>
         <w:gridCol w:w="2664"/>
-        <w:gridCol w:w="3744"/>
-        <w:gridCol w:w="2592"/>
       </w:tblGrid>
       <w:tr>
         <w:trPr>
@@ -570,9 +546,47 @@
             <w:r>
               <w:rPr>
                 <w:b/>
-                <w:sz w:val="17"/>
+                <w:sz w:val="16"/>
               </w:rPr>
               <w:t>#</w:t>
+            </w:r>
+          </w:p>
+        </w:tc>
+        <w:tc>
+          <w:tcPr>
+            <w:tcW w:type="dxa" w:w="2808"/>
+            <w:shd w:val="clear" w:color="auto" w:fill="E7E6E6"/>
+          </w:tcPr>
+          <w:p>
+            <w:pPr>
+              <w:spacing w:after="0" w:before="0" w:line="240" w:lineRule="auto"/>
+            </w:pPr>
+            <w:r/>
+            <w:r>
+              <w:rPr>
+                <w:b/>
+                <w:sz w:val="16"/>
+              </w:rPr>
+              <w:t>Feedback</w:t>
+            </w:r>
+          </w:p>
+        </w:tc>
+        <w:tc>
+          <w:tcPr>
+            <w:tcW w:type="dxa" w:w="3528"/>
+            <w:shd w:val="clear" w:color="auto" w:fill="E7E6E6"/>
+          </w:tcPr>
+          <w:p>
+            <w:pPr>
+              <w:spacing w:after="0" w:before="0" w:line="240" w:lineRule="auto"/>
+            </w:pPr>
+            <w:r/>
+            <w:r>
+              <w:rPr>
+                <w:b/>
+                <w:sz w:val="16"/>
+              </w:rPr>
+              <w:t>Team response</w:t>
             </w:r>
           </w:p>
         </w:tc>
@@ -589,45 +603,7 @@
             <w:r>
               <w:rPr>
                 <w:b/>
-                <w:sz w:val="17"/>
-              </w:rPr>
-              <w:t>Feedback</w:t>
-            </w:r>
-          </w:p>
-        </w:tc>
-        <w:tc>
-          <w:tcPr>
-            <w:tcW w:type="dxa" w:w="3744"/>
-            <w:shd w:val="clear" w:color="auto" w:fill="E7E6E6"/>
-          </w:tcPr>
-          <w:p>
-            <w:pPr>
-              <w:spacing w:after="0" w:before="0" w:line="240" w:lineRule="auto"/>
-            </w:pPr>
-            <w:r/>
-            <w:r>
-              <w:rPr>
-                <w:b/>
-                <w:sz w:val="17"/>
-              </w:rPr>
-              <w:t>Team response</w:t>
-            </w:r>
-          </w:p>
-        </w:tc>
-        <w:tc>
-          <w:tcPr>
-            <w:tcW w:type="dxa" w:w="2592"/>
-            <w:shd w:val="clear" w:color="auto" w:fill="E7E6E6"/>
-          </w:tcPr>
-          <w:p>
-            <w:pPr>
-              <w:spacing w:after="0" w:before="0" w:line="240" w:lineRule="auto"/>
-            </w:pPr>
-            <w:r/>
-            <w:r>
-              <w:rPr>
-                <w:b/>
-                <w:sz w:val="17"/>
+                <w:sz w:val="16"/>
               </w:rPr>
               <w:t>Next action</w:t>
             </w:r>
@@ -649,7 +625,7 @@
             <w:r/>
             <w:r>
               <w:rPr>
-                <w:sz w:val="17"/>
+                <w:sz w:val="16"/>
               </w:rPr>
               <w:t>1</w:t>
             </w:r>
@@ -657,6 +633,40 @@
         </w:tc>
         <w:tc>
           <w:tcPr>
+            <w:tcW w:type="dxa" w:w="2808"/>
+          </w:tcPr>
+          <w:p>
+            <w:pPr>
+              <w:spacing w:after="0" w:before="0" w:line="240" w:lineRule="auto"/>
+            </w:pPr>
+            <w:r/>
+            <w:r>
+              <w:rPr>
+                <w:sz w:val="16"/>
+              </w:rPr>
+              <w:t>Correctness first: never change the original, log every change, ask before uncertain changes.</w:t>
+            </w:r>
+          </w:p>
+        </w:tc>
+        <w:tc>
+          <w:tcPr>
+            <w:tcW w:type="dxa" w:w="3528"/>
+          </w:tcPr>
+          <w:p>
+            <w:pPr>
+              <w:spacing w:after="0" w:before="0" w:line="240" w:lineRule="auto"/>
+            </w:pPr>
+            <w:r/>
+            <w:r>
+              <w:rPr>
+                <w:sz w:val="16"/>
+              </w:rPr>
+              <w:t>Original kept read-only; every fix is a new version with a logged reason, rows and cells touched, risk and approval. Risk is set in code, not by the model.</w:t>
+            </w:r>
+          </w:p>
+        </w:tc>
+        <w:tc>
+          <w:tcPr>
             <w:tcW w:type="dxa" w:w="2664"/>
           </w:tcPr>
           <w:p>
@@ -666,43 +676,9 @@
             <w:r/>
             <w:r>
               <w:rPr>
-                <w:sz w:val="17"/>
-              </w:rPr>
-              <w:t>Correctness first: never change the original, log every change, ask before uncertain changes.</w:t>
-            </w:r>
-          </w:p>
-        </w:tc>
-        <w:tc>
-          <w:tcPr>
-            <w:tcW w:type="dxa" w:w="3744"/>
-          </w:tcPr>
-          <w:p>
-            <w:pPr>
-              <w:spacing w:after="0" w:before="0" w:line="240" w:lineRule="auto"/>
-            </w:pPr>
-            <w:r/>
-            <w:r>
-              <w:rPr>
-                <w:sz w:val="17"/>
-              </w:rPr>
-              <w:t>The original is kept read-only. Every fix creates a new version with a change-log entry (reason, rows and cells touched, risk, approval). Risk is set in code, so the model cannot talk its way past it.</w:t>
-            </w:r>
-          </w:p>
-        </w:tc>
-        <w:tc>
-          <w:tcPr>
-            <w:tcW w:type="dxa" w:w="2592"/>
-          </w:tcPr>
-          <w:p>
-            <w:pPr>
-              <w:spacing w:after="0" w:before="0" w:line="240" w:lineRule="auto"/>
-            </w:pPr>
-            <w:r/>
-            <w:r>
-              <w:rPr>
-                <w:sz w:val="17"/>
-              </w:rPr>
-              <w:t>Show the change log and replay script; ask if they are enough for him to trust an answer.</w:t>
+                <w:sz w:val="16"/>
+              </w:rPr>
+              <w:t>Done; he confirmed the outputs give full auditability.</w:t>
             </w:r>
           </w:p>
         </w:tc>
@@ -722,7 +698,7 @@
             <w:r/>
             <w:r>
               <w:rPr>
-                <w:sz w:val="17"/>
+                <w:sz w:val="16"/>
               </w:rPr>
               <w:t>2</w:t>
             </w:r>
@@ -730,6 +706,40 @@
         </w:tc>
         <w:tc>
           <w:tcPr>
+            <w:tcW w:type="dxa" w:w="2808"/>
+          </w:tcPr>
+          <w:p>
+            <w:pPr>
+              <w:spacing w:after="0" w:before="0" w:line="240" w:lineRule="auto"/>
+            </w:pPr>
+            <w:r/>
+            <w:r>
+              <w:rPr>
+                <w:sz w:val="16"/>
+              </w:rPr>
+              <w:t>Only simple formatting fixes may run without asking.</w:t>
+            </w:r>
+          </w:p>
+        </w:tc>
+        <w:tc>
+          <w:tcPr>
+            <w:tcW w:type="dxa" w:w="3528"/>
+          </w:tcPr>
+          <w:p>
+            <w:pPr>
+              <w:spacing w:after="0" w:before="0" w:line="240" w:lineRule="auto"/>
+            </w:pPr>
+            <w:r/>
+            <w:r>
+              <w:rPr>
+                <w:sz w:val="16"/>
+              </w:rPr>
+              <w:t>Trimming, case or space merges and clean parses run on their own; everything else asks (3 times on his file).</w:t>
+            </w:r>
+          </w:p>
+        </w:tc>
+        <w:tc>
+          <w:tcPr>
             <w:tcW w:type="dxa" w:w="2664"/>
           </w:tcPr>
           <w:p>
@@ -739,43 +749,9 @@
             <w:r/>
             <w:r>
               <w:rPr>
-                <w:sz w:val="17"/>
-              </w:rPr>
-              <w:t>Only simple formatting fixes may run without asking.</w:t>
-            </w:r>
-          </w:p>
-        </w:tc>
-        <w:tc>
-          <w:tcPr>
-            <w:tcW w:type="dxa" w:w="3744"/>
-          </w:tcPr>
-          <w:p>
-            <w:pPr>
-              <w:spacing w:after="0" w:before="0" w:line="240" w:lineRule="auto"/>
-            </w:pPr>
-            <w:r/>
-            <w:r>
-              <w:rPr>
-                <w:sz w:val="17"/>
-              </w:rPr>
-              <w:t>Auto-applied: trimming spaces, merging labels that differ only by case or spaces, and parses that create no new missing values. Everything else asks. On his file DataSage asks 3 times.</w:t>
-            </w:r>
-          </w:p>
-        </w:tc>
-        <w:tc>
-          <w:tcPr>
-            <w:tcW w:type="dxa" w:w="2592"/>
-          </w:tcPr>
-          <w:p>
-            <w:pPr>
-              <w:spacing w:after="0" w:before="0" w:line="240" w:lineRule="auto"/>
-            </w:pPr>
-            <w:r/>
-            <w:r>
-              <w:rPr>
-                <w:sz w:val="17"/>
-              </w:rPr>
-              <w:t>Ask whether blanking one unreadable date should keep asking (now medium risk).</w:t>
+                <w:sz w:val="16"/>
+              </w:rPr>
+              <w:t>Keep; he finds 3 questions ideal.</w:t>
             </w:r>
           </w:p>
         </w:tc>
@@ -795,7 +771,7 @@
             <w:r/>
             <w:r>
               <w:rPr>
-                <w:sz w:val="17"/>
+                <w:sz w:val="16"/>
               </w:rPr>
               <w:t>3</w:t>
             </w:r>
@@ -803,6 +779,40 @@
         </w:tc>
         <w:tc>
           <w:tcPr>
+            <w:tcW w:type="dxa" w:w="2808"/>
+          </w:tcPr>
+          <w:p>
+            <w:pPr>
+              <w:spacing w:after="0" w:before="0" w:line="240" w:lineRule="auto"/>
+            </w:pPr>
+            <w:r/>
+            <w:r>
+              <w:rPr>
+                <w:sz w:val="16"/>
+              </w:rPr>
+              <w:t>Stay focused on CSV/Excel and common tabular issues.</w:t>
+            </w:r>
+          </w:p>
+        </w:tc>
+        <w:tc>
+          <w:tcPr>
+            <w:tcW w:type="dxa" w:w="3528"/>
+          </w:tcPr>
+          <w:p>
+            <w:pPr>
+              <w:spacing w:after="0" w:before="0" w:line="240" w:lineRule="auto"/>
+            </w:pPr>
+            <w:r/>
+            <w:r>
+              <w:rPr>
+                <w:sz w:val="16"/>
+              </w:rPr>
+              <w:t>8 issue types, 7 check tools, 9 fix tools; no new formats.</w:t>
+            </w:r>
+          </w:p>
+        </w:tc>
+        <w:tc>
+          <w:tcPr>
             <w:tcW w:type="dxa" w:w="2664"/>
           </w:tcPr>
           <w:p>
@@ -812,43 +822,9 @@
             <w:r/>
             <w:r>
               <w:rPr>
-                <w:sz w:val="17"/>
-              </w:rPr>
-              <w:t>Stay focused on CSV/Excel and common tabular issues.</w:t>
-            </w:r>
-          </w:p>
-        </w:tc>
-        <w:tc>
-          <w:tcPr>
-            <w:tcW w:type="dxa" w:w="3744"/>
-          </w:tcPr>
-          <w:p>
-            <w:pPr>
-              <w:spacing w:after="0" w:before="0" w:line="240" w:lineRule="auto"/>
-            </w:pPr>
-            <w:r/>
-            <w:r>
-              <w:rPr>
-                <w:sz w:val="17"/>
-              </w:rPr>
-              <w:t>8 issue types, 7 check tools, 9 fix tools; no new formats were added.</w:t>
-            </w:r>
-          </w:p>
-        </w:tc>
-        <w:tc>
-          <w:tcPr>
-            <w:tcW w:type="dxa" w:w="2592"/>
-          </w:tcPr>
-          <w:p>
-            <w:pPr>
-              <w:spacing w:after="0" w:before="0" w:line="240" w:lineRule="auto"/>
-            </w:pPr>
-            <w:r/>
-            <w:r>
-              <w:rPr>
-                <w:sz w:val="17"/>
-              </w:rPr>
-              <w:t>Freeze the scope (below).</w:t>
+                <w:sz w:val="16"/>
+              </w:rPr>
+              <w:t>Scope agreed (below).</w:t>
             </w:r>
           </w:p>
         </w:tc>
@@ -868,7 +844,7 @@
             <w:r/>
             <w:r>
               <w:rPr>
-                <w:sz w:val="17"/>
+                <w:sz w:val="16"/>
               </w:rPr>
               <w:t>4</w:t>
             </w:r>
@@ -876,6 +852,47 @@
         </w:tc>
         <w:tc>
           <w:tcPr>
+            <w:tcW w:type="dxa" w:w="2808"/>
+          </w:tcPr>
+          <w:p>
+            <w:pPr>
+              <w:spacing w:after="0" w:before="0" w:line="240" w:lineRule="auto"/>
+            </w:pPr>
+            <w:r/>
+            <w:r>
+              <w:rPr>
+                <w:sz w:val="16"/>
+              </w:rPr>
+              <w:t>Rules file first; trusted-document retrieval later.</w:t>
+            </w:r>
+          </w:p>
+        </w:tc>
+        <w:tc>
+          <w:tcPr>
+            <w:tcW w:type="dxa" w:w="3528"/>
+          </w:tcPr>
+          <w:p>
+            <w:pPr>
+              <w:spacing w:after="0" w:before="0" w:line="240" w:lineRule="auto"/>
+            </w:pPr>
+            <w:r/>
+            <w:r>
+              <w:rPr>
+                <w:rFonts w:ascii="Courier New" w:hAnsi="Courier New" w:eastAsia="Courier New"/>
+                <w:sz w:val="13"/>
+              </w:rPr>
+              <w:t>lookup_rules</w:t>
+            </w:r>
+            <w:r>
+              <w:rPr>
+                <w:sz w:val="16"/>
+              </w:rPr>
+              <w:t xml:space="preserve"> reads a JSON rules file. Retrieval not built.</w:t>
+            </w:r>
+          </w:p>
+        </w:tc>
+        <w:tc>
+          <w:tcPr>
             <w:tcW w:type="dxa" w:w="2664"/>
           </w:tcPr>
           <w:p>
@@ -885,50 +902,9 @@
             <w:r/>
             <w:r>
               <w:rPr>
-                <w:sz w:val="17"/>
-              </w:rPr>
-              <w:t>Start with a user rules file; trusted-document retrieval later.</w:t>
-            </w:r>
-          </w:p>
-        </w:tc>
-        <w:tc>
-          <w:tcPr>
-            <w:tcW w:type="dxa" w:w="3744"/>
-          </w:tcPr>
-          <w:p>
-            <w:pPr>
-              <w:spacing w:after="0" w:before="0" w:line="240" w:lineRule="auto"/>
-            </w:pPr>
-            <w:r/>
-            <w:r>
-              <w:rPr>
-                <w:rFonts w:ascii="Courier New" w:hAnsi="Courier New" w:eastAsia="Courier New"/>
-                <w:sz w:val="14"/>
-              </w:rPr>
-              <w:t>lookup_rules</w:t>
-            </w:r>
-            <w:r>
-              <w:rPr>
-                <w:sz w:val="17"/>
-              </w:rPr>
-              <w:t xml:space="preserve"> reads a JSON rules file (allowed labels, ranges, formulas, date format). Retrieval is not built.</w:t>
-            </w:r>
-          </w:p>
-        </w:tc>
-        <w:tc>
-          <w:tcPr>
-            <w:tcW w:type="dxa" w:w="2592"/>
-          </w:tcPr>
-          <w:p>
-            <w:pPr>
-              <w:spacing w:after="0" w:before="0" w:line="240" w:lineRule="auto"/>
-            </w:pPr>
-            <w:r/>
-            <w:r>
-              <w:rPr>
-                <w:sz w:val="17"/>
-              </w:rPr>
-              <w:t>Keep retrieval optional.</w:t>
+                <w:sz w:val="16"/>
+              </w:rPr>
+              <w:t>Retrieval stays optional.</w:t>
             </w:r>
           </w:p>
         </w:tc>
@@ -948,7 +924,7 @@
             <w:r/>
             <w:r>
               <w:rPr>
-                <w:sz w:val="17"/>
+                <w:sz w:val="16"/>
               </w:rPr>
               <w:t>5</w:t>
             </w:r>
@@ -956,6 +932,40 @@
         </w:tc>
         <w:tc>
           <w:tcPr>
+            <w:tcW w:type="dxa" w:w="2808"/>
+          </w:tcPr>
+          <w:p>
+            <w:pPr>
+              <w:spacing w:after="0" w:before="0" w:line="240" w:lineRule="auto"/>
+            </w:pPr>
+            <w:r/>
+            <w:r>
+              <w:rPr>
+                <w:sz w:val="16"/>
+              </w:rPr>
+              <w:t>Treat the numeric targets as initial goals; adjust after testing.</w:t>
+            </w:r>
+          </w:p>
+        </w:tc>
+        <w:tc>
+          <w:tcPr>
+            <w:tcW w:type="dxa" w:w="3528"/>
+          </w:tcPr>
+          <w:p>
+            <w:pPr>
+              <w:spacing w:after="0" w:before="0" w:line="240" w:lineRule="auto"/>
+            </w:pPr>
+            <w:r/>
+            <w:r>
+              <w:rPr>
+                <w:sz w:val="16"/>
+              </w:rPr>
+              <w:t>All targets measured (Section 3); speed with the large model misses 60 s.</w:t>
+            </w:r>
+          </w:p>
+        </w:tc>
+        <w:tc>
+          <w:tcPr>
             <w:tcW w:type="dxa" w:w="2664"/>
           </w:tcPr>
           <w:p>
@@ -965,43 +975,9 @@
             <w:r/>
             <w:r>
               <w:rPr>
-                <w:sz w:val="17"/>
-              </w:rPr>
-              <w:t>Treat the numeric targets as initial goals; adjust after testing.</w:t>
-            </w:r>
-          </w:p>
-        </w:tc>
-        <w:tc>
-          <w:tcPr>
-            <w:tcW w:type="dxa" w:w="3744"/>
-          </w:tcPr>
-          <w:p>
-            <w:pPr>
-              <w:spacing w:after="0" w:before="0" w:line="240" w:lineRule="auto"/>
-            </w:pPr>
-            <w:r/>
-            <w:r>
-              <w:rPr>
-                <w:sz w:val="17"/>
-              </w:rPr>
-              <w:t>All targets were measured (Section 3). Accuracy and safety targets are close or met; speed with the large model is not.</w:t>
-            </w:r>
-          </w:p>
-        </w:tc>
-        <w:tc>
-          <w:tcPr>
-            <w:tcW w:type="dxa" w:w="2592"/>
-          </w:tcPr>
-          <w:p>
-            <w:pPr>
-              <w:spacing w:after="0" w:before="0" w:line="240" w:lineRule="auto"/>
-            </w:pPr>
-            <w:r/>
-            <w:r>
-              <w:rPr>
-                <w:sz w:val="17"/>
-              </w:rPr>
-              <w:t>Agree on the adjusted targets below.</w:t>
+                <w:sz w:val="16"/>
+              </w:rPr>
+              <w:t>Adjusted targets agreed (below).</w:t>
             </w:r>
           </w:p>
         </w:tc>
@@ -1021,7 +997,7 @@
             <w:r/>
             <w:r>
               <w:rPr>
-                <w:sz w:val="17"/>
+                <w:sz w:val="16"/>
               </w:rPr>
               <w:t>6</w:t>
             </w:r>
@@ -1029,6 +1005,40 @@
         </w:tc>
         <w:tc>
           <w:tcPr>
+            <w:tcW w:type="dxa" w:w="2808"/>
+          </w:tcPr>
+          <w:p>
+            <w:pPr>
+              <w:spacing w:after="0" w:before="0" w:line="240" w:lineRule="auto"/>
+            </w:pPr>
+            <w:r/>
+            <w:r>
+              <w:rPr>
+                <w:sz w:val="16"/>
+              </w:rPr>
+              <w:t>Make the small model the default and keep the 60 s target; let users switch to the large model.</w:t>
+            </w:r>
+          </w:p>
+        </w:tc>
+        <w:tc>
+          <w:tcPr>
+            <w:tcW w:type="dxa" w:w="3528"/>
+          </w:tcPr>
+          <w:p>
+            <w:pPr>
+              <w:spacing w:after="0" w:before="0" w:line="240" w:lineRule="auto"/>
+            </w:pPr>
+            <w:r/>
+            <w:r>
+              <w:rPr>
+                <w:sz w:val="16"/>
+              </w:rPr>
+              <w:t>Small model with the rule: about 15 s, 90% / 80% on held-out tasks (Table 7).</w:t>
+            </w:r>
+          </w:p>
+        </w:tc>
+        <w:tc>
+          <w:tcPr>
             <w:tcW w:type="dxa" w:w="2664"/>
           </w:tcPr>
           <w:p>
@@ -1038,46 +1048,9 @@
             <w:r/>
             <w:r>
               <w:rPr>
-                <w:sz w:val="17"/>
-                <w:highlight w:val="yellow"/>
-              </w:rPr>
-              <w:t>[Milestone 2 feedback]</w:t>
-            </w:r>
-          </w:p>
-        </w:tc>
-        <w:tc>
-          <w:tcPr>
-            <w:tcW w:type="dxa" w:w="3744"/>
-          </w:tcPr>
-          <w:p>
-            <w:pPr>
-              <w:spacing w:after="0" w:before="0" w:line="240" w:lineRule="auto"/>
-            </w:pPr>
-            <w:r/>
-            <w:r>
-              <w:rPr>
-                <w:sz w:val="17"/>
-                <w:highlight w:val="yellow"/>
-              </w:rPr>
-              <w:t>[Team response]</w:t>
-            </w:r>
-          </w:p>
-        </w:tc>
-        <w:tc>
-          <w:tcPr>
-            <w:tcW w:type="dxa" w:w="2592"/>
-          </w:tcPr>
-          <w:p>
-            <w:pPr>
-              <w:spacing w:after="0" w:before="0" w:line="240" w:lineRule="auto"/>
-            </w:pPr>
-            <w:r/>
-            <w:r>
-              <w:rPr>
-                <w:sz w:val="17"/>
-                <w:highlight w:val="yellow"/>
-              </w:rPr>
-              <w:t>[Next action]</w:t>
+                <w:sz w:val="16"/>
+              </w:rPr>
+              <w:t>Make 30B the default with an option for 235B; close the gap to 90%.</w:t>
             </w:r>
           </w:p>
         </w:tc>
@@ -1097,7 +1070,7 @@
             <w:r/>
             <w:r>
               <w:rPr>
-                <w:sz w:val="17"/>
+                <w:sz w:val="16"/>
               </w:rPr>
               <w:t>7</w:t>
             </w:r>
@@ -1105,6 +1078,40 @@
         </w:tc>
         <w:tc>
           <w:tcPr>
+            <w:tcW w:type="dxa" w:w="2808"/>
+          </w:tcPr>
+          <w:p>
+            <w:pPr>
+              <w:spacing w:after="0" w:before="0" w:line="240" w:lineRule="auto"/>
+            </w:pPr>
+            <w:r/>
+            <w:r>
+              <w:rPr>
+                <w:sz w:val="16"/>
+              </w:rPr>
+              <w:t>Blank unreadable dates and convert clear date formats automatically; ask only on ambiguous dates.</w:t>
+            </w:r>
+          </w:p>
+        </w:tc>
+        <w:tc>
+          <w:tcPr>
+            <w:tcW w:type="dxa" w:w="3528"/>
+          </w:tcPr>
+          <w:p>
+            <w:pPr>
+              <w:spacing w:after="0" w:before="0" w:line="240" w:lineRule="auto"/>
+            </w:pPr>
+            <w:r/>
+            <w:r>
+              <w:rPr>
+                <w:sz w:val="16"/>
+              </w:rPr>
+              <w:t>Today an unreadable date asks first (medium risk) and only YYYY-MM-DD is accepted.</w:t>
+            </w:r>
+          </w:p>
+        </w:tc>
+        <w:tc>
+          <w:tcPr>
             <w:tcW w:type="dxa" w:w="2664"/>
           </w:tcPr>
           <w:p>
@@ -1114,46 +1121,168 @@
             <w:r/>
             <w:r>
               <w:rPr>
-                <w:sz w:val="17"/>
-                <w:highlight w:val="yellow"/>
-              </w:rPr>
-              <w:t>[Milestone 2 feedback]</w:t>
-            </w:r>
-          </w:p>
-        </w:tc>
-        <w:tc>
-          <w:tcPr>
-            <w:tcW w:type="dxa" w:w="3744"/>
-          </w:tcPr>
-          <w:p>
-            <w:pPr>
-              <w:spacing w:after="0" w:before="0" w:line="240" w:lineRule="auto"/>
-            </w:pPr>
-            <w:r/>
-            <w:r>
-              <w:rPr>
-                <w:sz w:val="17"/>
-                <w:highlight w:val="yellow"/>
-              </w:rPr>
-              <w:t>[Team response]</w:t>
-            </w:r>
-          </w:p>
-        </w:tc>
-        <w:tc>
-          <w:tcPr>
-            <w:tcW w:type="dxa" w:w="2592"/>
-          </w:tcPr>
-          <w:p>
-            <w:pPr>
-              <w:spacing w:after="0" w:before="0" w:line="240" w:lineRule="auto"/>
-            </w:pPr>
-            <w:r/>
-            <w:r>
-              <w:rPr>
-                <w:sz w:val="17"/>
-                <w:highlight w:val="yellow"/>
-              </w:rPr>
-              <w:t>[Next action]</w:t>
+                <w:sz w:val="16"/>
+              </w:rPr>
+              <w:t>Make both low risk and logged; ask only for dates like 03/04/2026.</w:t>
+            </w:r>
+          </w:p>
+        </w:tc>
+      </w:tr>
+      <w:tr>
+        <w:trPr>
+          <w:cantSplit/>
+        </w:trPr>
+        <w:tc>
+          <w:tcPr>
+            <w:tcW w:type="dxa" w:w="360"/>
+          </w:tcPr>
+          <w:p>
+            <w:pPr>
+              <w:spacing w:after="0" w:before="0" w:line="240" w:lineRule="auto"/>
+            </w:pPr>
+            <w:r/>
+            <w:r>
+              <w:rPr>
+                <w:sz w:val="16"/>
+              </w:rPr>
+              <w:t>8</w:t>
+            </w:r>
+          </w:p>
+        </w:tc>
+        <w:tc>
+          <w:tcPr>
+            <w:tcW w:type="dxa" w:w="2808"/>
+          </w:tcPr>
+          <w:p>
+            <w:pPr>
+              <w:spacing w:after="0" w:before="0" w:line="240" w:lineRule="auto"/>
+            </w:pPr>
+            <w:r/>
+            <w:r>
+              <w:rPr>
+                <w:sz w:val="16"/>
+              </w:rPr>
+              <w:t>Let a rules file mark negative quantities as refunds (</w:t>
+            </w:r>
+            <w:r>
+              <w:rPr>
+                <w:rFonts w:ascii="Courier New" w:hAnsi="Courier New" w:eastAsia="Courier New"/>
+                <w:sz w:val="13"/>
+              </w:rPr>
+              <w:t>allow_negative_quantities</w:t>
+            </w:r>
+            <w:r>
+              <w:rPr>
+                <w:sz w:val="16"/>
+              </w:rPr>
+              <w:t>).</w:t>
+            </w:r>
+          </w:p>
+        </w:tc>
+        <w:tc>
+          <w:tcPr>
+            <w:tcW w:type="dxa" w:w="3528"/>
+          </w:tcPr>
+          <w:p>
+            <w:pPr>
+              <w:spacing w:after="0" w:before="0" w:line="240" w:lineRule="auto"/>
+            </w:pPr>
+            <w:r/>
+            <w:r>
+              <w:rPr>
+                <w:sz w:val="16"/>
+              </w:rPr>
+              <w:t>Not supported yet; negatives are always treated as rule breaks.</w:t>
+            </w:r>
+          </w:p>
+        </w:tc>
+        <w:tc>
+          <w:tcPr>
+            <w:tcW w:type="dxa" w:w="2664"/>
+          </w:tcPr>
+          <w:p>
+            <w:pPr>
+              <w:spacing w:after="0" w:before="0" w:line="240" w:lineRule="auto"/>
+            </w:pPr>
+            <w:r/>
+            <w:r>
+              <w:rPr>
+                <w:sz w:val="16"/>
+              </w:rPr>
+              <w:t>Add the rule key; keep such rows without asking.</w:t>
+            </w:r>
+          </w:p>
+        </w:tc>
+      </w:tr>
+      <w:tr>
+        <w:trPr>
+          <w:cantSplit/>
+        </w:trPr>
+        <w:tc>
+          <w:tcPr>
+            <w:tcW w:type="dxa" w:w="360"/>
+          </w:tcPr>
+          <w:p>
+            <w:pPr>
+              <w:spacing w:after="0" w:before="0" w:line="240" w:lineRule="auto"/>
+            </w:pPr>
+            <w:r/>
+            <w:r>
+              <w:rPr>
+                <w:sz w:val="16"/>
+              </w:rPr>
+              <w:t>9</w:t>
+            </w:r>
+          </w:p>
+        </w:tc>
+        <w:tc>
+          <w:tcPr>
+            <w:tcW w:type="dxa" w:w="2808"/>
+          </w:tcPr>
+          <w:p>
+            <w:pPr>
+              <w:spacing w:after="0" w:before="0" w:line="240" w:lineRule="auto"/>
+            </w:pPr>
+            <w:r/>
+            <w:r>
+              <w:rPr>
+                <w:sz w:val="16"/>
+              </w:rPr>
+              <w:t>Keep checking only question columns; drop near-duplicates; skip the code sandbox.</w:t>
+            </w:r>
+          </w:p>
+        </w:tc>
+        <w:tc>
+          <w:tcPr>
+            <w:tcW w:type="dxa" w:w="3528"/>
+          </w:tcPr>
+          <w:p>
+            <w:pPr>
+              <w:spacing w:after="0" w:before="0" w:line="240" w:lineRule="auto"/>
+            </w:pPr>
+            <w:r/>
+            <w:r>
+              <w:rPr>
+                <w:sz w:val="16"/>
+              </w:rPr>
+              <w:t>Matches the current design.</w:t>
+            </w:r>
+          </w:p>
+        </w:tc>
+        <w:tc>
+          <w:tcPr>
+            <w:tcW w:type="dxa" w:w="2664"/>
+          </w:tcPr>
+          <w:p>
+            <w:pPr>
+              <w:spacing w:after="0" w:before="0" w:line="240" w:lineRule="auto"/>
+            </w:pPr>
+            <w:r/>
+            <w:r>
+              <w:rPr>
+                <w:sz w:val="16"/>
+              </w:rPr>
+              <w:t>Removed from remaining work (Section 6).</w:t>
             </w:r>
           </w:p>
         </w:tc>
@@ -1170,51 +1299,10 @@
         <w:rPr>
           <w:b/>
         </w:rPr>
-        <w:t>Final deliverables and scope</w:t>
-      </w:r>
-      <w:r>
-        <w:t xml:space="preserve"> (our proposal; </w:t>
-      </w:r>
-      <w:r>
-        <w:rPr>
-          <w:highlight w:val="yellow"/>
-        </w:rPr>
-        <w:t>[confirm with the stakeholder at the meeting]</w:t>
-      </w:r>
-      <w:r>
-        <w:t>):</w:t>
-      </w:r>
-    </w:p>
-    <w:p>
-      <w:pPr>
-        <w:pStyle w:val="ListBullet"/>
-      </w:pPr>
-      <w:r>
-        <w:t>The DataSage command-line tool for one CSV or Excel table, a plain-English question and an optional rules file, covering the issue types in Section 2 and writing the five Milestone 1 outputs: quality report, change log, cleaned copy, answer with caveats, and a replay script.</w:t>
-      </w:r>
-    </w:p>
-    <w:p>
-      <w:pPr>
-        <w:pStyle w:val="ListBullet"/>
-      </w:pPr>
-      <w:r>
-        <w:t>A simple Streamlit page for the demo, where the stakeholder uploads a file, answers the approval prompts and reads the report.</w:t>
-      </w:r>
-    </w:p>
-    <w:p>
-      <w:pPr>
-        <w:pStyle w:val="ListBullet"/>
-      </w:pPr>
-      <w:r>
-        <w:t>Cleaning recipes: save an approved cleaning plan and replay it on next month's file with the same columns.</w:t>
-      </w:r>
-    </w:p>
-    <w:p>
-      <w:pPr>
-        <w:pStyle w:val="ListBullet"/>
-      </w:pPr>
-      <w:r>
-        <w:t>A final evaluation on the held-out tasks plus 5 to 10 real messy public files, the stakeholder's ratings of 10 reports, and an acceptance test on files he chooses. Out of scope as before: joins across tables, unstructured data, machine learning, and writing back to the source.</w:t>
+        <w:t>Final deliverables and scope (agreed October 28):</w:t>
+      </w:r>
+      <w:r>
+        <w:t xml:space="preserve"> (1) the DataSage command-line tool for one CSV or Excel table, a question and an optional rules file, with the five Milestone 1 outputs (quality report, change log, cleaned copy, answer with caveats, replay script); (2) a Streamlit page for the demo; (3) reusable cleaning recipes; (4) a final evaluation on the held-out tasks plus real messy files; and (5) his ratings of 10 reports and an acceptance test. Out of scope: joins across tables, unstructured data, machine learning, writing back to the source, near-duplicate rows and the code sandbox; trusted-document retrieval only if time allows.</w:t>
       </w:r>
     </w:p>
     <w:p>
@@ -1223,10 +1311,10 @@
         <w:rPr>
           <w:b/>
         </w:rPr>
-        <w:t>Success criteria</w:t>
-      </w:r>
-      <w:r>
-        <w:t xml:space="preserve"> (proposed changes to Milestone 1 Table 4): keep answer accuracy ≥ 90% on held-out tasks, zero damaged valid cells or rows, median approvals ≤ 3 and tool-call success ≥ 95%. Report tokens per task instead of dollars, because the ASU endpoint we use has no per-call price. The 60-second target is the open question: only the 30B model meets it (Section 3), so we will ask the stakeholder to pick between a faster default model and a slower, larger one.</w:t>
+        <w:t>Success criteria (agreed):</w:t>
+      </w:r>
+      <w:r>
+        <w:t xml:space="preserve"> answer accuracy ≥ 90% on the held-out tasks, zero damaged valid data, detection precision ≥ 0.85 and recall ≥ 0.80, planted errors handled ≥ 80%, completion and tool-call success ≥ 95%, at most 3 approvals per question, and ≤ 60 s per question with the small model. Cost is reported in tokens. The acceptance test passes if 3 test files reach ≥ 90% answer accuracy with no valid data corrupted.</w:t>
       </w:r>
     </w:p>
     <w:p>
@@ -1240,7 +1328,7 @@
     <w:p>
       <w:pPr/>
       <w:r>
-        <w:t>DataSage is a single planner agent that calls tools in a loop. The model makes the judgment calls (what to check, which fix fits, when the data is clean enough), and plain Python does every computation. Figure 1 shows the implemented system. Solid boxes are built and evaluated, dashed boxes are planned, and NEW marks changes since Milestone 1.</w:t>
+        <w:t>DataSage is a single planner agent that calls tools in a loop: the model makes the judgment calls (what to check, which fix fits, when the data is clean enough) and plain Python does every computation. In Figure 1, solid boxes are built, dashed boxes are planned, and NEW marks changes since Milestone 1.</w:t>
       </w:r>
     </w:p>
     <w:p>
@@ -1519,7 +1607,7 @@
         <w:t>ask_user</w:t>
       </w:r>
       <w:r>
-        <w:t>: asking now happens inside each fix call through the gate, and a rejection becomes a caveat, so the model never decides on its own whether to ask. (c) The model sees the chat history with each tool result cut to 6,000 characters, not a compact state summary rebuilt every step. Runs are short (median 12 tool calls), so the history fits, but it costs tokens (Section 5). (d) After the failure analysis we added one rule to the system prompt about rule-breaking rows (Section 5); results are reported with and without it. (e) Dates are accepted only as YYYY-MM-DD, so a different format such as 03/04/2026 is flagged as invalid, not converted, and near-duplicate rows are not detected yet. Both were in the Milestone 1 scope and are listed in Section 6.</w:t>
+        <w:t>: asking now happens inside each fix call through the gate, and a rejection becomes a caveat, so the model never decides on its own whether to ask. (c) The model sees the chat history with each tool result cut to 6,000 characters, not a compact state summary rebuilt every step. Runs are short (median 12 tool calls), so the history fits, but it costs tokens (Section 5). (d) After the failure analysis we added one rule to the system prompt about rule-breaking rows (Section 5); results are reported with and without it. (e) Dates are accepted only as YYYY-MM-DD, so a different format such as 03/04/2026 is flagged as invalid, not converted (planned, Section 6). Near-duplicate rows are not detected; the stakeholder dropped them from scope.</w:t>
       </w:r>
     </w:p>
     <w:p>
@@ -2350,7 +2438,7 @@
     <w:p>
       <w:pPr/>
       <w:r>
-        <w:t>We built a planted-error benchmark (</w:t>
+        <w:t>Our planted-error benchmark (</w:t>
       </w:r>
       <w:r>
         <w:rPr>
@@ -2360,7 +2448,7 @@
         <w:t>eval/generate.py</w:t>
       </w:r>
       <w:r>
-        <w:t xml:space="preserve">) so every task has an exact correct answer. The generator starts from a clean table, plants errors of the in-scope types and records each one (row id, column, type, messy value, clean value and the correct resolution: restore the value, exclude the row, set it to missing, keep it missing, or drop the duplicate copy). Applying those resolutions to the clean table gives a reference table, and each question's reference answer is computed on it with the same </w:t>
+        <w:t xml:space="preserve">) gives every task an exact answer. It plants errors in a clean table and records each one (row, column, type, messy and clean value, and the correct resolution: restore, exclude the row, set or keep missing, or drop the copy). Applying the resolutions gives a reference table, and each reference answer is computed on it with the same </w:t>
       </w:r>
       <w:r>
         <w:rPr>
@@ -2370,7 +2458,7 @@
         <w:t>analyze</w:t>
       </w:r>
       <w:r>
-        <w:t xml:space="preserve"> code the agent uses. Each table gets two questions (counts, sums or means by group, some with a filter), chosen so they touch the columns with planted errors. Every table ships with a rules file. Table 3 summarizes the two datasets and the two splits.</w:t>
+        <w:t xml:space="preserve"> code the agent uses. Each table has a rules file and two questions (counts, sums or means by group, some filtered) that touch the planted errors (Table 3).</w:t>
       </w:r>
     </w:p>
     <w:p>
@@ -8057,7 +8145,7 @@
       <w:r>
         <w:drawing>
           <wp:inline xmlns:a="http://schemas.openxmlformats.org/drawingml/2006/main" xmlns:pic="http://schemas.openxmlformats.org/drawingml/2006/picture">
-            <wp:extent cx="4937760" cy="3331501"/>
+            <wp:extent cx="4754880" cy="3208112"/>
             <wp:docPr id="3" name="Picture 3"/>
             <wp:cNvGraphicFramePr>
               <a:graphicFrameLocks noChangeAspect="1"/>
@@ -8078,7 +8166,7 @@
                   <pic:spPr>
                     <a:xfrm>
                       <a:off x="0" y="0"/>
-                      <a:ext cx="4937760" cy="3331501"/>
+                      <a:ext cx="4754880" cy="3208112"/>
                     </a:xfrm>
                     <a:prstGeom prst="rect"/>
                   </pic:spPr>
@@ -8189,7 +8277,7 @@
         <w:t>eval/failures.py</w:t>
       </w:r>
       <w:r>
-        <w:t xml:space="preserve"> reads the trace and planted errors of every wrong task and lists likely causes (for example "never ran a check for out_of_range" or "checked another column but not the one with the error"). We read the traces of the main cases by hand to confirm the label.</w:t>
+        <w:t xml:space="preserve"> lists the likely cause of every wrong task from its trace and planted errors (for example "never ran a check for out_of_range"); we confirmed the main cases by reading the traces.</w:t>
       </w:r>
     </w:p>
     <w:p>
@@ -8209,7 +8297,7 @@
       <w:r>
         <w:drawing>
           <wp:inline xmlns:a="http://schemas.openxmlformats.org/drawingml/2006/main" xmlns:pic="http://schemas.openxmlformats.org/drawingml/2006/picture">
-            <wp:extent cx="5943600" cy="1196150"/>
+            <wp:extent cx="5669280" cy="1140943"/>
             <wp:docPr id="4" name="Picture 4"/>
             <wp:cNvGraphicFramePr>
               <a:graphicFrameLocks noChangeAspect="1"/>
@@ -8230,7 +8318,7 @@
                   <pic:spPr>
                     <a:xfrm>
                       <a:off x="0" y="0"/>
-                      <a:ext cx="5943600" cy="1196150"/>
+                      <a:ext cx="5669280" cy="1140943"/>
                     </a:xfrm>
                     <a:prstGeom prst="rect"/>
                   </pic:spPr>
@@ -8543,7 +8631,7 @@
         <w:t>Coverage and data.</w:t>
       </w:r>
       <w:r>
-        <w:t xml:space="preserve"> Only group-by, aggregate and filter questions on one table, dates only as YYYY-MM-DD, and no near-duplicate check. All errors are planted by our own generator into small tables, so real messy files (Section 6, item 4) are needed before we can say the numbers carry over.</w:t>
+        <w:t xml:space="preserve"> Only group-by, aggregate and filter questions on one table (enough for the stakeholder), and dates only as YYYY-MM-DD. All errors are planted by our own generator into small tables, so real messy files (Section 6, item 4) are needed before we can say the numbers carry over.</w:t>
       </w:r>
     </w:p>
     <w:p>
@@ -8599,17 +8687,7 @@
     <w:p>
       <w:pPr/>
       <w:r>
-        <w:t xml:space="preserve">Table 9 lists the remaining work in priority order. Items 1 to 8 are required; item 9, the </w:t>
-      </w:r>
-      <w:r>
-        <w:rPr>
-          <w:rFonts w:ascii="Courier New" w:hAnsi="Courier New" w:eastAsia="Courier New"/>
-          <w:sz w:val="19"/>
-        </w:rPr>
-        <w:t>run_pandas</w:t>
-      </w:r>
-      <w:r>
-        <w:t xml:space="preserve"> sandbox and trusted-document retrieval are optional. Owners are </w:t>
+        <w:t xml:space="preserve">Table 9 lists the remaining work in priority order. Items 1 to 8 are required; trusted-document retrieval is optional. Near-duplicate rows and the code sandbox were dropped from scope by the stakeholder. Owners are </w:t>
       </w:r>
       <w:r>
         <w:rPr>
@@ -8646,10 +8724,10 @@
       <w:tblGrid>
         <w:gridCol w:w="360"/>
         <w:gridCol w:w="1655"/>
-        <w:gridCol w:w="1728"/>
-        <w:gridCol w:w="2520"/>
-        <w:gridCol w:w="1007"/>
-        <w:gridCol w:w="2088"/>
+        <w:gridCol w:w="1944"/>
+        <w:gridCol w:w="2736"/>
+        <w:gridCol w:w="864"/>
+        <w:gridCol w:w="1800"/>
       </w:tblGrid>
       <w:tr>
         <w:trPr>
@@ -8696,7 +8774,7 @@
         </w:tc>
         <w:tc>
           <w:tcPr>
-            <w:tcW w:type="dxa" w:w="1728"/>
+            <w:tcW w:type="dxa" w:w="1944"/>
             <w:shd w:val="clear" w:color="auto" w:fill="E7E6E6"/>
           </w:tcPr>
           <w:p>
@@ -8715,7 +8793,7 @@
         </w:tc>
         <w:tc>
           <w:tcPr>
-            <w:tcW w:type="dxa" w:w="2520"/>
+            <w:tcW w:type="dxa" w:w="2736"/>
             <w:shd w:val="clear" w:color="auto" w:fill="E7E6E6"/>
           </w:tcPr>
           <w:p>
@@ -8734,7 +8812,7 @@
         </w:tc>
         <w:tc>
           <w:tcPr>
-            <w:tcW w:type="dxa" w:w="1008"/>
+            <w:tcW w:type="dxa" w:w="864"/>
             <w:shd w:val="clear" w:color="auto" w:fill="E7E6E6"/>
           </w:tcPr>
           <w:p>
@@ -8753,7 +8831,7 @@
         </w:tc>
         <w:tc>
           <w:tcPr>
-            <w:tcW w:type="dxa" w:w="2088"/>
+            <w:tcW w:type="dxa" w:w="1800"/>
             <w:shd w:val="clear" w:color="auto" w:fill="E7E6E6"/>
           </w:tcPr>
           <w:p>
@@ -8805,13 +8883,13 @@
               <w:rPr>
                 <w:sz w:val="16"/>
               </w:rPr>
-              <w:t>Stakeholder review and scope sign-off</w:t>
-            </w:r>
-          </w:p>
-        </w:tc>
-        <w:tc>
-          <w:tcPr>
-            <w:tcW w:type="dxa" w:w="1728"/>
+              <w:t>Small model as default</w:t>
+            </w:r>
+          </w:p>
+        </w:tc>
+        <w:tc>
+          <w:tcPr>
+            <w:tcW w:type="dxa" w:w="1944"/>
           </w:tcPr>
           <w:p>
             <w:pPr>
@@ -8822,13 +8900,13 @@
               <w:rPr>
                 <w:sz w:val="16"/>
               </w:rPr>
-              <w:t>Oct 19 meeting was before the system was built</w:t>
-            </w:r>
-          </w:p>
-        </w:tc>
-        <w:tc>
-          <w:tcPr>
-            <w:tcW w:type="dxa" w:w="2520"/>
+              <w:t>30B with the rule: 90% / 80% on held-out</w:t>
+            </w:r>
+          </w:p>
+        </w:tc>
+        <w:tc>
+          <w:tcPr>
+            <w:tcW w:type="dxa" w:w="2736"/>
           </w:tcPr>
           <w:p>
             <w:pPr>
@@ -8839,13 +8917,13 @@
               <w:rPr>
                 <w:sz w:val="16"/>
               </w:rPr>
-              <w:t>Send the demo and results for his review (input form); record his answers in Section 1</w:t>
-            </w:r>
-          </w:p>
-        </w:tc>
-        <w:tc>
-          <w:tcPr>
-            <w:tcW w:type="dxa" w:w="1008"/>
+              <w:t>30B default, 235B optional; compact state summary instead of full history</w:t>
+            </w:r>
+          </w:p>
+        </w:tc>
+        <w:tc>
+          <w:tcPr>
+            <w:tcW w:type="dxa" w:w="864"/>
           </w:tcPr>
           <w:p>
             <w:pPr>
@@ -8863,7 +8941,7 @@
         </w:tc>
         <w:tc>
           <w:tcPr>
-            <w:tcW w:type="dxa" w:w="2088"/>
+            <w:tcW w:type="dxa" w:w="1800"/>
           </w:tcPr>
           <w:p>
             <w:pPr>
@@ -8874,7 +8952,7 @@
               <w:rPr>
                 <w:sz w:val="16"/>
               </w:rPr>
-              <w:t>Scope, deliverables and targets confirmed in writing</w:t>
+              <w:t>≥ 90% on held-out in ≤ 60 s</w:t>
             </w:r>
           </w:p>
         </w:tc>
@@ -8913,13 +8991,13 @@
               <w:rPr>
                 <w:sz w:val="16"/>
               </w:rPr>
-              <w:t>Coverage check and spelling merges</w:t>
-            </w:r>
-          </w:p>
-        </w:tc>
-        <w:tc>
-          <w:tcPr>
-            <w:tcW w:type="dxa" w:w="1728"/>
+              <w:t>Coverage check, spelling merges</w:t>
+            </w:r>
+          </w:p>
+        </w:tc>
+        <w:tc>
+          <w:tcPr>
+            <w:tcW w:type="dxa" w:w="1944"/>
           </w:tcPr>
           <w:p>
             <w:pPr>
@@ -8930,13 +9008,13 @@
               <w:rPr>
                 <w:sz w:val="16"/>
               </w:rPr>
-              <w:t>Metric column sometimes never checked (Section 5, case 2); misspellings found but not merged (held-out sales)</w:t>
-            </w:r>
-          </w:p>
-        </w:tc>
-        <w:tc>
-          <w:tcPr>
-            <w:tcW w:type="dxa" w:w="2520"/>
+              <w:t>Metric never checked (case 2); misspellings not merged</w:t>
+            </w:r>
+          </w:p>
+        </w:tc>
+        <w:tc>
+          <w:tcPr>
+            <w:tcW w:type="dxa" w:w="2736"/>
           </w:tcPr>
           <w:p>
             <w:pPr>
@@ -8947,7 +9025,7 @@
               <w:rPr>
                 <w:sz w:val="16"/>
               </w:rPr>
-              <w:t xml:space="preserve">Code check in </w:t>
+              <w:t xml:space="preserve">Check columns in </w:t>
             </w:r>
             <w:r>
               <w:rPr>
@@ -8960,13 +9038,13 @@
               <w:rPr>
                 <w:sz w:val="16"/>
               </w:rPr>
-              <w:t>; prompt rule to propose merges into labels the rules allow; re-run held-out tasks</w:t>
-            </w:r>
-          </w:p>
-        </w:tc>
-        <w:tc>
-          <w:tcPr>
-            <w:tcW w:type="dxa" w:w="1008"/>
+              <w:t>; rule to propose merges into allowed labels</w:t>
+            </w:r>
+          </w:p>
+        </w:tc>
+        <w:tc>
+          <w:tcPr>
+            <w:tcW w:type="dxa" w:w="864"/>
           </w:tcPr>
           <w:p>
             <w:pPr>
@@ -8984,7 +9062,7 @@
         </w:tc>
         <w:tc>
           <w:tcPr>
-            <w:tcW w:type="dxa" w:w="2088"/>
+            <w:tcW w:type="dxa" w:w="1800"/>
           </w:tcPr>
           <w:p>
             <w:pPr>
@@ -8995,7 +9073,7 @@
               <w:rPr>
                 <w:sz w:val="16"/>
               </w:rPr>
-              <w:t>No "never checked" or unmerged-misspelling failures on held-out, no accuracy drop</w:t>
+              <w:t>No such failures on held-out</w:t>
             </w:r>
           </w:p>
         </w:tc>
@@ -9034,13 +9112,13 @@
               <w:rPr>
                 <w:sz w:val="16"/>
               </w:rPr>
-              <w:t>Default model and speed</w:t>
-            </w:r>
-          </w:p>
-        </w:tc>
-        <w:tc>
-          <w:tcPr>
-            <w:tcW w:type="dxa" w:w="1728"/>
+              <w:t>Dates and refunds (his unmet needs)</w:t>
+            </w:r>
+          </w:p>
+        </w:tc>
+        <w:tc>
+          <w:tcPr>
+            <w:tcW w:type="dxa" w:w="1944"/>
           </w:tcPr>
           <w:p>
             <w:pPr>
@@ -9051,13 +9129,13 @@
               <w:rPr>
                 <w:sz w:val="16"/>
               </w:rPr>
-              <w:t>235B median well over 60 s; ~50k tokens per task</w:t>
-            </w:r>
-          </w:p>
-        </w:tc>
-        <w:tc>
-          <w:tcPr>
-            <w:tcW w:type="dxa" w:w="2520"/>
+              <w:t>Unreadable dates ask; YYYY-MM-DD only; negatives always rule breaks</w:t>
+            </w:r>
+          </w:p>
+        </w:tc>
+        <w:tc>
+          <w:tcPr>
+            <w:tcW w:type="dxa" w:w="2736"/>
           </w:tcPr>
           <w:p>
             <w:pPr>
@@ -9068,13 +9146,20 @@
               <w:rPr>
                 <w:sz w:val="16"/>
               </w:rPr>
-              <w:t>Send a compact state summary instead of full history; compare 235B and 30B with the rule on held-out</w:t>
-            </w:r>
-          </w:p>
-        </w:tc>
-        <w:tc>
-          <w:tcPr>
-            <w:tcW w:type="dxa" w:w="1008"/>
+              <w:t xml:space="preserve">Auto-blank and convert clear formats, ask on ambiguous; </w:t>
+            </w:r>
+            <w:r>
+              <w:rPr>
+                <w:rFonts w:ascii="Courier New" w:hAnsi="Courier New" w:eastAsia="Courier New"/>
+                <w:sz w:val="13"/>
+              </w:rPr>
+              <w:t>allow_negative_quantities</w:t>
+            </w:r>
+          </w:p>
+        </w:tc>
+        <w:tc>
+          <w:tcPr>
+            <w:tcW w:type="dxa" w:w="864"/>
           </w:tcPr>
           <w:p>
             <w:pPr>
@@ -9092,7 +9177,7 @@
         </w:tc>
         <w:tc>
           <w:tcPr>
-            <w:tcW w:type="dxa" w:w="2088"/>
+            <w:tcW w:type="dxa" w:w="1800"/>
           </w:tcPr>
           <w:p>
             <w:pPr>
@@ -9103,7 +9188,7 @@
               <w:rPr>
                 <w:sz w:val="16"/>
               </w:rPr>
-              <w:t>Stakeholder picks a model based on measured accuracy vs time</w:t>
+              <w:t>His two files answered correctly</w:t>
             </w:r>
           </w:p>
         </w:tc>
@@ -9148,7 +9233,7 @@
         </w:tc>
         <w:tc>
           <w:tcPr>
-            <w:tcW w:type="dxa" w:w="1728"/>
+            <w:tcW w:type="dxa" w:w="1944"/>
           </w:tcPr>
           <w:p>
             <w:pPr>
@@ -9159,13 +9244,13 @@
               <w:rPr>
                 <w:sz w:val="16"/>
               </w:rPr>
-              <w:t>Only planted errors so far</w:t>
-            </w:r>
-          </w:p>
-        </w:tc>
-        <w:tc>
-          <w:tcPr>
-            <w:tcW w:type="dxa" w:w="2520"/>
+              <w:t>Planted errors only</w:t>
+            </w:r>
+          </w:p>
+        </w:tc>
+        <w:tc>
+          <w:tcPr>
+            <w:tcW w:type="dxa" w:w="2736"/>
           </w:tcPr>
           <w:p>
             <w:pPr>
@@ -9176,13 +9261,13 @@
               <w:rPr>
                 <w:sz w:val="16"/>
               </w:rPr>
-              <w:t>5 to 10 public files with real problems, labeled by two members</w:t>
-            </w:r>
-          </w:p>
-        </w:tc>
-        <w:tc>
-          <w:tcPr>
-            <w:tcW w:type="dxa" w:w="1008"/>
+              <w:t>His two files, questions and draft rules (sending summaries to ASU allowed), plus public files</w:t>
+            </w:r>
+          </w:p>
+        </w:tc>
+        <w:tc>
+          <w:tcPr>
+            <w:tcW w:type="dxa" w:w="864"/>
           </w:tcPr>
           <w:p>
             <w:pPr>
@@ -9200,7 +9285,7 @@
         </w:tc>
         <w:tc>
           <w:tcPr>
-            <w:tcW w:type="dxa" w:w="2088"/>
+            <w:tcW w:type="dxa" w:w="1800"/>
           </w:tcPr>
           <w:p>
             <w:pPr>
@@ -9211,7 +9296,7 @@
               <w:rPr>
                 <w:sz w:val="16"/>
               </w:rPr>
-              <w:t>Labeled set and results for all systems</w:t>
+              <w:t>Results for all systems</w:t>
             </w:r>
           </w:p>
         </w:tc>
@@ -9256,7 +9341,7 @@
         </w:tc>
         <w:tc>
           <w:tcPr>
-            <w:tcW w:type="dxa" w:w="1728"/>
+            <w:tcW w:type="dxa" w:w="1944"/>
           </w:tcPr>
           <w:p>
             <w:pPr>
@@ -9273,7 +9358,7 @@
         </w:tc>
         <w:tc>
           <w:tcPr>
-            <w:tcW w:type="dxa" w:w="2520"/>
+            <w:tcW w:type="dxa" w:w="2736"/>
           </w:tcPr>
           <w:p>
             <w:pPr>
@@ -9284,13 +9369,13 @@
               <w:rPr>
                 <w:sz w:val="16"/>
               </w:rPr>
-              <w:t>3 runs of DataSage and B2 on held-out tasks</w:t>
-            </w:r>
-          </w:p>
-        </w:tc>
-        <w:tc>
-          <w:tcPr>
-            <w:tcW w:type="dxa" w:w="1008"/>
+              <w:t>3 runs of DataSage and B2 on held-out</w:t>
+            </w:r>
+          </w:p>
+        </w:tc>
+        <w:tc>
+          <w:tcPr>
+            <w:tcW w:type="dxa" w:w="864"/>
           </w:tcPr>
           <w:p>
             <w:pPr>
@@ -9308,7 +9393,7 @@
         </w:tc>
         <w:tc>
           <w:tcPr>
-            <w:tcW w:type="dxa" w:w="2088"/>
+            <w:tcW w:type="dxa" w:w="1800"/>
           </w:tcPr>
           <w:p>
             <w:pPr>
@@ -9319,7 +9404,7 @@
               <w:rPr>
                 <w:sz w:val="16"/>
               </w:rPr>
-              <w:t>Mean and range reported</w:t>
+              <w:t>Mean and range</w:t>
             </w:r>
           </w:p>
         </w:tc>
@@ -9358,13 +9443,13 @@
               <w:rPr>
                 <w:sz w:val="16"/>
               </w:rPr>
-              <w:t>Stakeholder ratings and acceptance test</w:t>
-            </w:r>
-          </w:p>
-        </w:tc>
-        <w:tc>
-          <w:tcPr>
-            <w:tcW w:type="dxa" w:w="1728"/>
+              <w:t>Ratings and acceptance test</w:t>
+            </w:r>
+          </w:p>
+        </w:tc>
+        <w:tc>
+          <w:tcPr>
+            <w:tcW w:type="dxa" w:w="1944"/>
           </w:tcPr>
           <w:p>
             <w:pPr>
@@ -9381,7 +9466,7 @@
         </w:tc>
         <w:tc>
           <w:tcPr>
-            <w:tcW w:type="dxa" w:w="2520"/>
+            <w:tcW w:type="dxa" w:w="2736"/>
           </w:tcPr>
           <w:p>
             <w:pPr>
@@ -9392,13 +9477,13 @@
               <w:rPr>
                 <w:sz w:val="16"/>
               </w:rPr>
-              <w:t>He rates 10 reports 1 to 5 (correctness, clarity, trust) and runs files he chooses</w:t>
-            </w:r>
-          </w:p>
-        </w:tc>
-        <w:tc>
-          <w:tcPr>
-            <w:tcW w:type="dxa" w:w="1008"/>
+              <w:t>He rates 10 reports (Nov 16 to 20); 3 test files</w:t>
+            </w:r>
+          </w:p>
+        </w:tc>
+        <w:tc>
+          <w:tcPr>
+            <w:tcW w:type="dxa" w:w="864"/>
           </w:tcPr>
           <w:p>
             <w:pPr>
@@ -9416,7 +9501,7 @@
         </w:tc>
         <w:tc>
           <w:tcPr>
-            <w:tcW w:type="dxa" w:w="2088"/>
+            <w:tcW w:type="dxa" w:w="1800"/>
           </w:tcPr>
           <w:p>
             <w:pPr>
@@ -9427,7 +9512,7 @@
               <w:rPr>
                 <w:sz w:val="16"/>
               </w:rPr>
-              <w:t>Ratings and pass or fail in the final report</w:t>
+              <w:t>≥ 90% accuracy, no corrupted data</w:t>
             </w:r>
           </w:p>
         </w:tc>
@@ -9466,13 +9551,13 @@
               <w:rPr>
                 <w:sz w:val="16"/>
               </w:rPr>
-              <w:t>Streamlit demo page and cleaning recipes</w:t>
-            </w:r>
-          </w:p>
-        </w:tc>
-        <w:tc>
-          <w:tcPr>
-            <w:tcW w:type="dxa" w:w="1728"/>
+              <w:t>Streamlit page, cleaning recipes</w:t>
+            </w:r>
+          </w:p>
+        </w:tc>
+        <w:tc>
+          <w:tcPr>
+            <w:tcW w:type="dxa" w:w="1944"/>
           </w:tcPr>
           <w:p>
             <w:pPr>
@@ -9483,13 +9568,13 @@
               <w:rPr>
                 <w:sz w:val="16"/>
               </w:rPr>
-              <w:t>Command line only; no recipes</w:t>
-            </w:r>
-          </w:p>
-        </w:tc>
-        <w:tc>
-          <w:tcPr>
-            <w:tcW w:type="dxa" w:w="2520"/>
+              <w:t>Command line only</w:t>
+            </w:r>
+          </w:p>
+        </w:tc>
+        <w:tc>
+          <w:tcPr>
+            <w:tcW w:type="dxa" w:w="2736"/>
           </w:tcPr>
           <w:p>
             <w:pPr>
@@ -9500,13 +9585,13 @@
               <w:rPr>
                 <w:sz w:val="16"/>
               </w:rPr>
-              <w:t>Upload, approve and read the report in a browser; save an approved plan and replay it on a new file</w:t>
-            </w:r>
-          </w:p>
-        </w:tc>
-        <w:tc>
-          <w:tcPr>
-            <w:tcW w:type="dxa" w:w="1008"/>
+              <w:t>Upload, approve, read the report in a browser; save and replay an approved plan</w:t>
+            </w:r>
+          </w:p>
+        </w:tc>
+        <w:tc>
+          <w:tcPr>
+            <w:tcW w:type="dxa" w:w="864"/>
           </w:tcPr>
           <w:p>
             <w:pPr>
@@ -9524,7 +9609,7 @@
         </w:tc>
         <w:tc>
           <w:tcPr>
-            <w:tcW w:type="dxa" w:w="2088"/>
+            <w:tcW w:type="dxa" w:w="1800"/>
           </w:tcPr>
           <w:p>
             <w:pPr>
@@ -9535,7 +9620,7 @@
               <w:rPr>
                 <w:sz w:val="16"/>
               </w:rPr>
-              <w:t>Stakeholder uses the page at Demo Day; a recipe replays with the validator passing</w:t>
+              <w:t>Shown at Demo Day with the replay script</w:t>
             </w:r>
           </w:p>
         </w:tc>
@@ -9574,13 +9659,13 @@
               <w:rPr>
                 <w:sz w:val="16"/>
               </w:rPr>
-              <w:t>Final report, presentation and demo</w:t>
-            </w:r>
-          </w:p>
-        </w:tc>
-        <w:tc>
-          <w:tcPr>
-            <w:tcW w:type="dxa" w:w="1728"/>
+              <w:t>Review, final report, demo</w:t>
+            </w:r>
+          </w:p>
+        </w:tc>
+        <w:tc>
+          <w:tcPr>
+            <w:tcW w:type="dxa" w:w="1944"/>
           </w:tcPr>
           <w:p>
             <w:pPr>
@@ -9597,7 +9682,7 @@
         </w:tc>
         <w:tc>
           <w:tcPr>
-            <w:tcW w:type="dxa" w:w="2520"/>
+            <w:tcW w:type="dxa" w:w="2736"/>
           </w:tcPr>
           <w:p>
             <w:pPr>
@@ -9608,13 +9693,13 @@
               <w:rPr>
                 <w:sz w:val="16"/>
               </w:rPr>
-              <w:t>Write up final results and failure cases</w:t>
-            </w:r>
-          </w:p>
-        </w:tc>
-        <w:tc>
-          <w:tcPr>
-            <w:tcW w:type="dxa" w:w="1008"/>
+              <w:t>Review on Nov 20, 2026, 2:00 PM MST (Zoom); final report and slides</w:t>
+            </w:r>
+          </w:p>
+        </w:tc>
+        <w:tc>
+          <w:tcPr>
+            <w:tcW w:type="dxa" w:w="864"/>
           </w:tcPr>
           <w:p>
             <w:pPr>
@@ -9631,7 +9716,7 @@
         </w:tc>
         <w:tc>
           <w:tcPr>
-            <w:tcW w:type="dxa" w:w="2088"/>
+            <w:tcW w:type="dxa" w:w="1800"/>
           </w:tcPr>
           <w:p>
             <w:pPr>
@@ -9643,114 +9728,6 @@
                 <w:sz w:val="16"/>
               </w:rPr>
               <w:t>Submitted</w:t>
-            </w:r>
-          </w:p>
-        </w:tc>
-      </w:tr>
-      <w:tr>
-        <w:trPr>
-          <w:cantSplit/>
-        </w:trPr>
-        <w:tc>
-          <w:tcPr>
-            <w:tcW w:type="dxa" w:w="360"/>
-          </w:tcPr>
-          <w:p>
-            <w:pPr>
-              <w:spacing w:after="0" w:before="0" w:line="240" w:lineRule="auto"/>
-            </w:pPr>
-            <w:r/>
-            <w:r>
-              <w:rPr>
-                <w:sz w:val="16"/>
-              </w:rPr>
-              <w:t>9</w:t>
-            </w:r>
-          </w:p>
-        </w:tc>
-        <w:tc>
-          <w:tcPr>
-            <w:tcW w:type="dxa" w:w="1656"/>
-          </w:tcPr>
-          <w:p>
-            <w:pPr>
-              <w:spacing w:after="0" w:before="0" w:line="240" w:lineRule="auto"/>
-            </w:pPr>
-            <w:r/>
-            <w:r>
-              <w:rPr>
-                <w:sz w:val="16"/>
-              </w:rPr>
-              <w:t>Date formats and near-duplicates</w:t>
-            </w:r>
-          </w:p>
-        </w:tc>
-        <w:tc>
-          <w:tcPr>
-            <w:tcW w:type="dxa" w:w="1728"/>
-          </w:tcPr>
-          <w:p>
-            <w:pPr>
-              <w:spacing w:after="0" w:before="0" w:line="240" w:lineRule="auto"/>
-            </w:pPr>
-            <w:r/>
-            <w:r>
-              <w:rPr>
-                <w:sz w:val="16"/>
-              </w:rPr>
-              <w:t>Only YYYY-MM-DD; no near-duplicate check</w:t>
-            </w:r>
-          </w:p>
-        </w:tc>
-        <w:tc>
-          <w:tcPr>
-            <w:tcW w:type="dxa" w:w="2520"/>
-          </w:tcPr>
-          <w:p>
-            <w:pPr>
-              <w:spacing w:after="0" w:before="0" w:line="240" w:lineRule="auto"/>
-            </w:pPr>
-            <w:r/>
-            <w:r>
-              <w:rPr>
-                <w:sz w:val="16"/>
-              </w:rPr>
-              <w:t>Convert unambiguous formats; flag ambiguous ones like 03/04 for approval</w:t>
-            </w:r>
-          </w:p>
-        </w:tc>
-        <w:tc>
-          <w:tcPr>
-            <w:tcW w:type="dxa" w:w="1008"/>
-          </w:tcPr>
-          <w:p>
-            <w:pPr>
-              <w:spacing w:after="0" w:before="0" w:line="240" w:lineRule="auto"/>
-            </w:pPr>
-            <w:r/>
-            <w:r>
-              <w:rPr>
-                <w:sz w:val="16"/>
-                <w:highlight w:val="yellow"/>
-              </w:rPr>
-              <w:t>[owner]</w:t>
-            </w:r>
-          </w:p>
-        </w:tc>
-        <w:tc>
-          <w:tcPr>
-            <w:tcW w:type="dxa" w:w="2088"/>
-          </w:tcPr>
-          <w:p>
-            <w:pPr>
-              <w:spacing w:after="0" w:before="0" w:line="240" w:lineRule="auto"/>
-            </w:pPr>
-            <w:r/>
-            <w:r>
-              <w:rPr>
-                <w:sz w:val="16"/>
-              </w:rPr>
-              <w:t>Planted-error tests for both pass</w:t>
             </w:r>
           </w:p>
         </w:tc>

</xml_diff>

<commit_message>
Milestone 2 report: fill in the October 19 meeting notes
</commit_message>
<xml_diff>
--- a/docs/milestone2/Group25_DataSage_Milestone2.docx
+++ b/docs/milestone2/Group25_DataSage_Milestone2.docx
@@ -452,16 +452,7 @@
         <w:t>Notes:</w:t>
       </w:r>
       <w:r>
-        <w:t xml:space="preserve"> </w:t>
-      </w:r>
-      <w:r>
-        <w:rPr>
-          <w:highlight w:val="yellow"/>
-        </w:rPr>
-        <w:t>[what was discussed on October 19, and his feedback then]</w:t>
-      </w:r>
-      <w:r>
-        <w:t>.</w:t>
+        <w:t xml:space="preserve"> the team walked through the plan and design (no working system yet). Vyshanth praised the planned replay script and change log and asked us to keep the defaults simple so users are not asked unnecessary questions. Because nothing was running yet, his review of the working system and results was done in writing afterwards.</w:t>
       </w:r>
     </w:p>
     <w:p>

</xml_diff>

<commit_message>
Milestone 2 report: fill in team contributions
</commit_message>
<xml_diff>
--- a/docs/milestone2/Group25_DataSage_Milestone2.docx
+++ b/docs/milestone2/Group25_DataSage_Milestone2.docx
@@ -9951,7 +9951,7 @@
               <w:rPr>
                 <w:sz w:val="16"/>
               </w:rPr>
-              <w:t>Agent, tools, approval gate, validator, analysis and report builder (</w:t>
+              <w:t>Code: the agent, tools, approval gate, validator, analysis and report builder (</w:t>
             </w:r>
             <w:r>
               <w:rPr>
@@ -9964,7 +9964,7 @@
               <w:rPr>
                 <w:sz w:val="16"/>
               </w:rPr>
-              <w:t>); baselines B1 and B2; benchmark generator, scoring, oracle, failure classifier and held-out split; tests; evaluation runs; diagram, demo, report draft.</w:t>
+              <w:t>); baselines B1 and B2; benchmark generator, scoring, oracle, failure classifier and held-out split; tests; evaluation runs; diagram and demo.</w:t>
             </w:r>
           </w:p>
         </w:tc>
@@ -10135,9 +10135,8 @@
             <w:r>
               <w:rPr>
                 <w:sz w:val="16"/>
-                <w:highlight w:val="yellow"/>
-              </w:rPr>
-              <w:t>[Contributions]</w:t>
+              </w:rPr>
+              <w:t>Report writing.</w:t>
             </w:r>
           </w:p>
         </w:tc>
@@ -10153,9 +10152,8 @@
             <w:r>
               <w:rPr>
                 <w:sz w:val="16"/>
-                <w:highlight w:val="yellow"/>
-              </w:rPr>
-              <w:t>[Links]</w:t>
+              </w:rPr>
+              <w:t>No commits (non-code work)</w:t>
             </w:r>
           </w:p>
         </w:tc>
@@ -10193,9 +10191,8 @@
             <w:r>
               <w:rPr>
                 <w:sz w:val="16"/>
-                <w:highlight w:val="yellow"/>
-              </w:rPr>
-              <w:t>[Contributions]</w:t>
+              </w:rPr>
+              <w:t>Stakeholder communication and meeting notes.</w:t>
             </w:r>
           </w:p>
         </w:tc>
@@ -10211,9 +10208,8 @@
             <w:r>
               <w:rPr>
                 <w:sz w:val="16"/>
-                <w:highlight w:val="yellow"/>
-              </w:rPr>
-              <w:t>[Links]</w:t>
+              </w:rPr>
+              <w:t>No commits (non-code work)</w:t>
             </w:r>
           </w:p>
         </w:tc>
@@ -10235,7 +10231,7 @@
               <w:rPr>
                 <w:sz w:val="16"/>
               </w:rPr>
-              <w:t>Vatsal Nirmal (vatsal-prog)</w:t>
+              <w:t>Maulik Jadav (maulik-jadav)</w:t>
             </w:r>
           </w:p>
         </w:tc>
@@ -10251,9 +10247,8 @@
             <w:r>
               <w:rPr>
                 <w:sz w:val="16"/>
-                <w:highlight w:val="yellow"/>
-              </w:rPr>
-              <w:t>[Contributions]</w:t>
+              </w:rPr>
+              <w:t>Reviewing the evaluation results.</w:t>
             </w:r>
           </w:p>
         </w:tc>
@@ -10269,9 +10264,8 @@
             <w:r>
               <w:rPr>
                 <w:sz w:val="16"/>
-                <w:highlight w:val="yellow"/>
-              </w:rPr>
-              <w:t>[Links]</w:t>
+              </w:rPr>
+              <w:t>No commits (non-code work)</w:t>
             </w:r>
           </w:p>
         </w:tc>
@@ -10293,7 +10287,7 @@
               <w:rPr>
                 <w:sz w:val="16"/>
               </w:rPr>
-              <w:t>Maulik Jadav (maulik-jadav)</w:t>
+              <w:t>Vatsal Nirmal (vatsal-prog)</w:t>
             </w:r>
           </w:p>
         </w:tc>
@@ -10309,9 +10303,8 @@
             <w:r>
               <w:rPr>
                 <w:sz w:val="16"/>
-                <w:highlight w:val="yellow"/>
-              </w:rPr>
-              <w:t>[Contributions]</w:t>
+              </w:rPr>
+              <w:t>Team coordination.</w:t>
             </w:r>
           </w:p>
         </w:tc>
@@ -10327,66 +10320,8 @@
             <w:r>
               <w:rPr>
                 <w:sz w:val="16"/>
-                <w:highlight w:val="yellow"/>
-              </w:rPr>
-              <w:t>[Links]</w:t>
-            </w:r>
-          </w:p>
-        </w:tc>
-      </w:tr>
-      <w:tr>
-        <w:trPr>
-          <w:cantSplit/>
-        </w:trPr>
-        <w:tc>
-          <w:tcPr>
-            <w:tcW w:type="dxa" w:w="1944"/>
-          </w:tcPr>
-          <w:p>
-            <w:pPr>
-              <w:spacing w:after="0" w:before="0" w:line="240" w:lineRule="auto"/>
-            </w:pPr>
-            <w:r/>
-            <w:r>
-              <w:rPr>
-                <w:sz w:val="16"/>
-              </w:rPr>
-              <w:t>Work not shown in commits</w:t>
-            </w:r>
-          </w:p>
-        </w:tc>
-        <w:tc>
-          <w:tcPr>
-            <w:tcW w:type="dxa" w:w="4320"/>
-          </w:tcPr>
-          <w:p>
-            <w:pPr>
-              <w:spacing w:after="0" w:before="0" w:line="240" w:lineRule="auto"/>
-            </w:pPr>
-            <w:r/>
-            <w:r>
-              <w:rPr>
-                <w:sz w:val="16"/>
-                <w:highlight w:val="yellow"/>
-              </w:rPr>
-              <w:t>[Stakeholder communication, meeting notes, reviewing results, report writing: who did what]</w:t>
-            </w:r>
-          </w:p>
-        </w:tc>
-        <w:tc>
-          <w:tcPr>
-            <w:tcW w:type="dxa" w:w="3096"/>
-          </w:tcPr>
-          <w:p>
-            <w:pPr>
-              <w:spacing w:after="0" w:before="0" w:line="240" w:lineRule="auto"/>
-            </w:pPr>
-            <w:r/>
-            <w:r>
-              <w:rPr>
-                <w:sz w:val="16"/>
-              </w:rPr>
-              <w:t>-</w:t>
+              </w:rPr>
+              <w:t>No commits (non-code work)</w:t>
             </w:r>
           </w:p>
         </w:tc>

</xml_diff>

<commit_message>
Milestone 2 report: assign owners for the remaining work
</commit_message>
<xml_diff>
--- a/docs/milestone2/Group25_DataSage_Milestone2.docx
+++ b/docs/milestone2/Group25_DataSage_Milestone2.docx
@@ -8678,16 +8678,7 @@
     <w:p>
       <w:pPr/>
       <w:r>
-        <w:t xml:space="preserve">Table 9 lists the remaining work in priority order. Items 1 to 8 are required; trusted-document retrieval is optional. Near-duplicate rows and the code sandbox were dropped from scope by the stakeholder. Owners are </w:t>
-      </w:r>
-      <w:r>
-        <w:rPr>
-          <w:highlight w:val="yellow"/>
-        </w:rPr>
-        <w:t>[to be agreed by the team]</w:t>
-      </w:r>
-      <w:r>
-        <w:t>.</w:t>
+        <w:t>Table 9 lists the remaining work in priority order. Items 1 to 8 are required; trusted-document retrieval is optional. Near-duplicate rows and the code sandbox were dropped from scope by the stakeholder.</w:t>
       </w:r>
     </w:p>
     <w:p>
@@ -8924,9 +8915,8 @@
             <w:r>
               <w:rPr>
                 <w:sz w:val="16"/>
-                <w:highlight w:val="yellow"/>
-              </w:rPr>
-              <w:t>[owner]</w:t>
+              </w:rPr>
+              <w:t>Shrey</w:t>
             </w:r>
           </w:p>
         </w:tc>
@@ -9045,9 +9035,8 @@
             <w:r>
               <w:rPr>
                 <w:sz w:val="16"/>
-                <w:highlight w:val="yellow"/>
-              </w:rPr>
-              <w:t>[owner]</w:t>
+              </w:rPr>
+              <w:t>Shrey</w:t>
             </w:r>
           </w:p>
         </w:tc>
@@ -9160,9 +9149,8 @@
             <w:r>
               <w:rPr>
                 <w:sz w:val="16"/>
-                <w:highlight w:val="yellow"/>
-              </w:rPr>
-              <w:t>[owner]</w:t>
+              </w:rPr>
+              <w:t>Maulik</w:t>
             </w:r>
           </w:p>
         </w:tc>
@@ -9268,9 +9256,8 @@
             <w:r>
               <w:rPr>
                 <w:sz w:val="16"/>
-                <w:highlight w:val="yellow"/>
-              </w:rPr>
-              <w:t>[owners]</w:t>
+              </w:rPr>
+              <w:t>Maulik, Vatsal</w:t>
             </w:r>
           </w:p>
         </w:tc>
@@ -9376,9 +9363,8 @@
             <w:r>
               <w:rPr>
                 <w:sz w:val="16"/>
-                <w:highlight w:val="yellow"/>
-              </w:rPr>
-              <w:t>[owner]</w:t>
+              </w:rPr>
+              <w:t>Arsha</w:t>
             </w:r>
           </w:p>
         </w:tc>
@@ -9484,9 +9470,8 @@
             <w:r>
               <w:rPr>
                 <w:sz w:val="16"/>
-                <w:highlight w:val="yellow"/>
-              </w:rPr>
-              <w:t>[owner]</w:t>
+              </w:rPr>
+              <w:t>Arsha</w:t>
             </w:r>
           </w:p>
         </w:tc>
@@ -9592,9 +9577,8 @@
             <w:r>
               <w:rPr>
                 <w:sz w:val="16"/>
-                <w:highlight w:val="yellow"/>
-              </w:rPr>
-              <w:t>[owners]</w:t>
+              </w:rPr>
+              <w:t>Ritik, Arsha</w:t>
             </w:r>
           </w:p>
         </w:tc>

</xml_diff>

<commit_message>
Milestone 2 report: leave teammates' commit cells blank
</commit_message>
<xml_diff>
--- a/docs/milestone2/Group25_DataSage_Milestone2.docx
+++ b/docs/milestone2/Group25_DataSage_Milestone2.docx
@@ -10133,12 +10133,6 @@
               <w:spacing w:after="0" w:before="0" w:line="240" w:lineRule="auto"/>
             </w:pPr>
             <w:r/>
-            <w:r>
-              <w:rPr>
-                <w:sz w:val="16"/>
-              </w:rPr>
-              <w:t>No commits (non-code work)</w:t>
-            </w:r>
           </w:p>
         </w:tc>
       </w:tr>
@@ -10189,12 +10183,6 @@
               <w:spacing w:after="0" w:before="0" w:line="240" w:lineRule="auto"/>
             </w:pPr>
             <w:r/>
-            <w:r>
-              <w:rPr>
-                <w:sz w:val="16"/>
-              </w:rPr>
-              <w:t>No commits (non-code work)</w:t>
-            </w:r>
           </w:p>
         </w:tc>
       </w:tr>
@@ -10245,12 +10233,6 @@
               <w:spacing w:after="0" w:before="0" w:line="240" w:lineRule="auto"/>
             </w:pPr>
             <w:r/>
-            <w:r>
-              <w:rPr>
-                <w:sz w:val="16"/>
-              </w:rPr>
-              <w:t>No commits (non-code work)</w:t>
-            </w:r>
           </w:p>
         </w:tc>
       </w:tr>
@@ -10301,12 +10283,6 @@
               <w:spacing w:after="0" w:before="0" w:line="240" w:lineRule="auto"/>
             </w:pPr>
             <w:r/>
-            <w:r>
-              <w:rPr>
-                <w:sz w:val="16"/>
-              </w:rPr>
-              <w:t>No commits (non-code work)</w:t>
-            </w:r>
           </w:p>
         </w:tc>
       </w:tr>

</xml_diff>

<commit_message>
Milestone 2 report: list each member's work so far and their assigned next tasks
</commit_message>
<xml_diff>
--- a/docs/milestone2/Group25_DataSage_Milestone2.docx
+++ b/docs/milestone2/Group25_DataSage_Milestone2.docx
@@ -10120,7 +10120,7 @@
               <w:rPr>
                 <w:sz w:val="16"/>
               </w:rPr>
-              <w:t>Report writing.</w:t>
+              <w:t>Wrote the Milestone 2 report. Next (Section 6, items 5 to 7): repeated runs, the stakeholder ratings and acceptance test, and with Ritik the code for the Streamlit page and cleaning recipes.</w:t>
             </w:r>
           </w:p>
         </w:tc>
@@ -10170,7 +10170,7 @@
               <w:rPr>
                 <w:sz w:val="16"/>
               </w:rPr>
-              <w:t>Stakeholder communication and meeting notes.</w:t>
+              <w:t>Stakeholder communication and the October 19 meeting notes. Next (item 7): with Arsha, the code for the Streamlit demo page and cleaning recipes.</w:t>
             </w:r>
           </w:p>
         </w:tc>
@@ -10220,7 +10220,7 @@
               <w:rPr>
                 <w:sz w:val="16"/>
               </w:rPr>
-              <w:t>Reviewing the evaluation results.</w:t>
+              <w:t>Reviewed the evaluation results. Next (items 3 and 4): the code for automatic date handling and the refund rule key, and with Vatsal the evaluation on real messy files.</w:t>
             </w:r>
           </w:p>
         </w:tc>
@@ -10270,7 +10270,7 @@
               <w:rPr>
                 <w:sz w:val="16"/>
               </w:rPr>
-              <w:t>Team coordination.</w:t>
+              <w:t>Team coordination. Next (item 4): with Maulik, preparing the real messy files (the stakeholder's two files and public ones) and their rules and reference answers.</w:t>
             </w:r>
           </w:p>
         </w:tc>

</xml_diff>